<commit_message>
Actualizacion de animaciones 2026-09-30 19:47
</commit_message>
<xml_diff>
--- a/T3_Conexionado_complejo_Automatismos.docx
+++ b/T3_Conexionado_complejo_Automatismos.docx
@@ -1572,7 +1572,7 @@
                 <w:sz w:val="20"/>
                 <w:szCs w:val="20"/>
               </w:rPr>
-              <w:t xml:space="preserve">La fuerza: arranque directo e inversión de giro.</w:t>
+              <w:t xml:space="preserve">La fuerza: arranque directo de un motor.</w:t>
             </w:r>
           </w:p>
         </w:tc>
@@ -1607,6 +1607,124 @@
                 <w:szCs w:val="20"/>
               </w:rPr>
               <w:t xml:space="preserve">arranque_motor</w:t>
+            </w:r>
+          </w:p>
+        </w:tc>
+      </w:tr>
+      <w:tr>
+        <w:trPr>
+          <w:cantSplit/>
+        </w:trPr>
+        <w:tc>
+          <w:tcPr>
+            <w:tcW w:type="dxa" w:w="2972"/>
+            <w:tcBorders>
+              <w:top w:val="single" w:color="333333" w:sz="6"/>
+              <w:left w:val="single" w:color="333333" w:sz="6"/>
+              <w:bottom w:val="single" w:color="333333" w:sz="6"/>
+              <w:right w:val="single" w:color="333333" w:sz="6"/>
+            </w:tcBorders>
+            <w:shd w:fill="D8EFB8" w:color="auto" w:val="clear"/>
+            <w:tcMar>
+              <w:top w:type="dxa" w:w="50"/>
+              <w:left w:type="dxa" w:w="90"/>
+              <w:bottom w:type="dxa" w:w="50"/>
+              <w:right w:type="dxa" w:w="90"/>
+            </w:tcMar>
+            <w:vAlign w:val="center"/>
+          </w:tcPr>
+          <w:p>
+            <w:pPr>
+              <w:spacing w:after="0"/>
+              <w:jc w:val="left"/>
+            </w:pPr>
+            <w:r>
+              <w:rPr>
+                <w:rFonts w:ascii="Calibri" w:cs="Calibri" w:eastAsia="Calibri" w:hAnsi="Calibri"/>
+                <w:b/>
+                <w:bCs/>
+                <w:sz w:val="20"/>
+                <w:szCs w:val="20"/>
+              </w:rPr>
+              <w:t xml:space="preserve">3.10</w:t>
+            </w:r>
+            <w:r>
+              <w:rPr>
+                <w:rFonts w:ascii="Calibri" w:cs="Calibri" w:eastAsia="Calibri" w:hAnsi="Calibri"/>
+                <w:b/>
+                <w:bCs/>
+                <w:sz w:val="20"/>
+                <w:szCs w:val="20"/>
+              </w:rPr>
+              <w:t xml:space="preserve"> Inversión de giro</w:t>
+            </w:r>
+          </w:p>
+        </w:tc>
+        <w:tc>
+          <w:tcPr>
+            <w:tcW w:type="dxa" w:w="4161"/>
+            <w:tcBorders>
+              <w:top w:val="single" w:color="333333" w:sz="6"/>
+              <w:left w:val="single" w:color="333333" w:sz="6"/>
+              <w:bottom w:val="single" w:color="333333" w:sz="6"/>
+              <w:right w:val="single" w:color="333333" w:sz="6"/>
+            </w:tcBorders>
+            <w:tcMar>
+              <w:top w:type="dxa" w:w="50"/>
+              <w:left w:type="dxa" w:w="90"/>
+              <w:bottom w:type="dxa" w:w="50"/>
+              <w:right w:type="dxa" w:w="90"/>
+            </w:tcMar>
+            <w:vAlign w:val="center"/>
+          </w:tcPr>
+          <w:p>
+            <w:pPr>
+              <w:spacing w:after="0"/>
+              <w:jc w:val="left"/>
+            </w:pPr>
+            <w:r>
+              <w:rPr>
+                <w:rFonts w:ascii="Calibri" w:cs="Calibri" w:eastAsia="Calibri" w:hAnsi="Calibri"/>
+                <w:b w:val="false"/>
+                <w:bCs w:val="false"/>
+                <w:sz w:val="20"/>
+                <w:szCs w:val="20"/>
+              </w:rPr>
+              <w:t xml:space="preserve">Fuerza y mando para que el motor gire en los dos sentidos.</w:t>
+            </w:r>
+          </w:p>
+        </w:tc>
+        <w:tc>
+          <w:tcPr>
+            <w:tcW w:type="dxa" w:w="2773"/>
+            <w:tcBorders>
+              <w:top w:val="single" w:color="333333" w:sz="6"/>
+              <w:left w:val="single" w:color="333333" w:sz="6"/>
+              <w:bottom w:val="single" w:color="333333" w:sz="6"/>
+              <w:right w:val="single" w:color="333333" w:sz="6"/>
+            </w:tcBorders>
+            <w:tcMar>
+              <w:top w:type="dxa" w:w="50"/>
+              <w:left w:type="dxa" w:w="90"/>
+              <w:bottom w:type="dxa" w:w="50"/>
+              <w:right w:type="dxa" w:w="90"/>
+            </w:tcMar>
+            <w:vAlign w:val="center"/>
+          </w:tcPr>
+          <w:p>
+            <w:pPr>
+              <w:spacing w:after="0"/>
+              <w:jc w:val="left"/>
+            </w:pPr>
+            <w:r>
+              <w:rPr>
+                <w:rFonts w:ascii="Calibri" w:cs="Calibri" w:eastAsia="Calibri" w:hAnsi="Calibri"/>
+                <w:b w:val="false"/>
+                <w:bCs w:val="false"/>
+                <w:sz w:val="20"/>
+                <w:szCs w:val="20"/>
+              </w:rPr>
+              <w:t xml:space="preserve">inversion_giro</w:t>
             </w:r>
           </w:p>
         </w:tc>
@@ -3228,7 +3346,7 @@
             <w:pPr>
               <w:spacing w:after="0"/>
             </w:pPr>
-            <w:hyperlink w:history="1" r:id="rIdrw7tbya1z9ebp3jvjuur9">
+            <w:hyperlink w:history="1" r:id="rIdc7nuz7vaktr-wvyjyjbx5">
               <w:r>
                 <w:rPr>
                   <w:rFonts w:ascii="Calibri" w:cs="Calibri" w:eastAsia="Calibri" w:hAnsi="Calibri"/>
@@ -4595,7 +4713,7 @@
             <w:pPr>
               <w:spacing w:after="0"/>
             </w:pPr>
-            <w:hyperlink w:history="1" r:id="rIdr_sjfryayssi61tilwtpz">
+            <w:hyperlink w:history="1" r:id="rIdeyshmtq2f7jjhhbv-_x64">
               <w:r>
                 <w:rPr>
                   <w:rFonts w:ascii="Calibri" w:cs="Calibri" w:eastAsia="Calibri" w:hAnsi="Calibri"/>
@@ -5602,7 +5720,7 @@
             <w:pPr>
               <w:spacing w:after="0"/>
             </w:pPr>
-            <w:hyperlink w:history="1" r:id="rIdleiqaggdyvjasl0xzlcjv">
+            <w:hyperlink w:history="1" r:id="rIdzyn0v2kzv4h_lhienjzkm">
               <w:r>
                 <w:rPr>
                   <w:rFonts w:ascii="Calibri" w:cs="Calibri" w:eastAsia="Calibri" w:hAnsi="Calibri"/>
@@ -6875,7 +6993,7 @@
             <w:pPr>
               <w:spacing w:after="0"/>
             </w:pPr>
-            <w:hyperlink w:history="1" r:id="rIddplaoqgmoozte5kxalzqr">
+            <w:hyperlink w:history="1" r:id="rId29eawff7ftkgv8jnqcvtn">
               <w:r>
                 <w:rPr>
                   <w:rFonts w:ascii="Calibri" w:cs="Calibri" w:eastAsia="Calibri" w:hAnsi="Calibri"/>
@@ -9167,7 +9285,7 @@
             <w:pPr>
               <w:spacing w:after="0"/>
             </w:pPr>
-            <w:hyperlink w:history="1" r:id="rIdnxpr6lw6vbbvwng3eqb7j">
+            <w:hyperlink w:history="1" r:id="rIds7prepprshlfdg_w8jzln">
               <w:r>
                 <w:rPr>
                   <w:rFonts w:ascii="Calibri" w:cs="Calibri" w:eastAsia="Calibri" w:hAnsi="Calibri"/>
@@ -10449,7 +10567,7 @@
             <w:pPr>
               <w:spacing w:after="0"/>
             </w:pPr>
-            <w:hyperlink w:history="1" r:id="rIdviogwfcxfaoyd3ajn_zip">
+            <w:hyperlink w:history="1" r:id="rIdaplvab61kkozkde8wuj8n">
               <w:r>
                 <w:rPr>
                   <w:rFonts w:ascii="Calibri" w:cs="Calibri" w:eastAsia="Calibri" w:hAnsi="Calibri"/>
@@ -10543,7 +10661,7 @@
           <w:sz w:val="22"/>
           <w:szCs w:val="22"/>
         </w:rPr>
-        <w:t xml:space="preserve"> en la fuerza (lo verás en el 3.9).</w:t>
+        <w:t xml:space="preserve"> en la fuerza (lo verás en el 3.10).</w:t>
       </w:r>
     </w:p>
     <w:p>
@@ -11328,7 +11446,7 @@
             <w:pPr>
               <w:spacing w:after="0"/>
             </w:pPr>
-            <w:hyperlink w:history="1" r:id="rId_4qcm2g3h7lhdotgwizba">
+            <w:hyperlink w:history="1" r:id="rIddomszjpwrsz31ru816n-w">
               <w:r>
                 <w:rPr>
                   <w:rFonts w:ascii="Calibri" w:cs="Calibri" w:eastAsia="Calibri" w:hAnsi="Calibri"/>
@@ -13064,7 +13182,7 @@
             <w:pPr>
               <w:spacing w:after="0"/>
             </w:pPr>
-            <w:hyperlink w:history="1" r:id="rIdb7bmiz_l5o8helukakpmv">
+            <w:hyperlink w:history="1" r:id="rIduqzlpt_fw_zpja-149ncz">
               <w:r>
                 <w:rPr>
                   <w:rFonts w:ascii="Calibri" w:cs="Calibri" w:eastAsia="Calibri" w:hAnsi="Calibri"/>
@@ -14694,7 +14812,7 @@
             <w:pPr>
               <w:spacing w:after="0"/>
             </w:pPr>
-            <w:hyperlink w:history="1" r:id="rIdh9f9kxhywb-mchti4jgwy">
+            <w:hyperlink w:history="1" r:id="rIdy79iyhgnqt4toszavdeov">
               <w:r>
                 <w:rPr>
                   <w:rFonts w:ascii="Calibri" w:cs="Calibri" w:eastAsia="Calibri" w:hAnsi="Calibri"/>
@@ -15694,7 +15812,7 @@
             <w:pPr>
               <w:spacing w:after="0"/>
             </w:pPr>
-            <w:hyperlink w:history="1" r:id="rIdljc3q-inej9ddiepefopq">
+            <w:hyperlink w:history="1" r:id="rIdn8pokheqap57w-wmscjbv">
               <w:r>
                 <w:rPr>
                   <w:rFonts w:ascii="Calibri" w:cs="Calibri" w:eastAsia="Calibri" w:hAnsi="Calibri"/>
@@ -15712,23 +15830,14 @@
     </w:tbl>
     <w:p>
       <w:pPr>
-        <w:keepNext/>
+        <w:pStyle w:val="Heading1"/>
         <w:pageBreakBefore/>
-        <w:pBdr>
-          <w:bottom w:val="single" w:color="8CC63F" w:sz="12" w:space="2"/>
-        </w:pBdr>
-        <w:spacing w:after="120" w:before="200"/>
       </w:pPr>
       <w:r>
         <w:rPr>
           <w:rFonts w:ascii="Calibri" w:cs="Calibri" w:eastAsia="Calibri" w:hAnsi="Calibri"/>
-          <w:b/>
-          <w:bCs/>
-          <w:color w:val="222222"/>
-          <w:sz w:val="23"/>
-          <w:szCs w:val="23"/>
-        </w:rPr>
-        <w:t xml:space="preserve">INVERSIÓN DE GIRO</w:t>
+        </w:rPr>
+        <w:t xml:space="preserve">3.10 La inversión de giro</w:t>
       </w:r>
     </w:p>
     <w:tbl>
@@ -16301,6 +16410,224 @@
     </w:tbl>
     <w:p>
       <w:pPr>
+        <w:spacing w:after="80" w:before="0"/>
+      </w:pPr>
+    </w:p>
+    <w:p>
+      <w:pPr>
+        <w:keepNext w:val="false"/>
+        <w:spacing w:after="110" w:before="0" w:line="264" w:lineRule="auto"/>
+        <w:jc w:val="both"/>
+      </w:pPr>
+      <w:r>
+        <w:rPr>
+          <w:rFonts w:ascii="Calibri" w:cs="Calibri" w:eastAsia="Calibri" w:hAnsi="Calibri"/>
+          <w:sz w:val="22"/>
+          <w:szCs w:val="22"/>
+        </w:rPr>
+        <w:t xml:space="preserve">El </w:t>
+      </w:r>
+      <w:r>
+        <w:rPr>
+          <w:rFonts w:ascii="Calibri" w:cs="Calibri" w:eastAsia="Calibri" w:hAnsi="Calibri"/>
+          <w:b/>
+          <w:bCs/>
+          <w:sz w:val="22"/>
+          <w:szCs w:val="22"/>
+        </w:rPr>
+        <w:t xml:space="preserve">mando</w:t>
+      </w:r>
+      <w:r>
+        <w:rPr>
+          <w:rFonts w:ascii="Calibri" w:cs="Calibri" w:eastAsia="Calibri" w:hAnsi="Calibri"/>
+          <w:sz w:val="22"/>
+          <w:szCs w:val="22"/>
+        </w:rPr>
+        <w:t xml:space="preserve"> es el del enclavamiento (3.6), añadiendo arriba el </w:t>
+      </w:r>
+      <w:r>
+        <w:rPr>
+          <w:rFonts w:ascii="Calibri" w:cs="Calibri" w:eastAsia="Calibri" w:hAnsi="Calibri"/>
+          <w:b/>
+          <w:bCs/>
+          <w:sz w:val="22"/>
+          <w:szCs w:val="22"/>
+        </w:rPr>
+        <w:t xml:space="preserve">95-96 de -F2</w:t>
+      </w:r>
+      <w:r>
+        <w:rPr>
+          <w:rFonts w:ascii="Calibri" w:cs="Calibri" w:eastAsia="Calibri" w:hAnsi="Calibri"/>
+          <w:sz w:val="22"/>
+          <w:szCs w:val="22"/>
+        </w:rPr>
+        <w:t xml:space="preserve">, igual que en el arranque directo. Así, si hay una sobrecarga, se para el motor gire hacia donde gire.</w:t>
+      </w:r>
+    </w:p>
+    <w:tbl>
+      <w:tblPr>
+        <w:tblW w:type="dxa" w:w="9906"/>
+        <w:tblBorders>
+          <w:top w:val="single" w:color="auto" w:sz="4"/>
+          <w:left w:val="single" w:color="auto" w:sz="4"/>
+          <w:bottom w:val="single" w:color="auto" w:sz="4"/>
+          <w:right w:val="single" w:color="auto" w:sz="4"/>
+          <w:insideH w:val="single" w:color="auto" w:sz="4"/>
+          <w:insideV w:val="single" w:color="auto" w:sz="4"/>
+        </w:tblBorders>
+      </w:tblPr>
+      <w:tblGrid>
+        <w:gridCol w:w="1700"/>
+        <w:gridCol w:w="8206"/>
+      </w:tblGrid>
+      <w:tr>
+        <w:trPr>
+          <w:cantSplit/>
+        </w:trPr>
+        <w:tc>
+          <w:tcPr>
+            <w:tcW w:type="dxa" w:w="1700"/>
+            <w:tcBorders>
+              <w:top w:val="single" w:color="F2B400" w:sz="4"/>
+              <w:left w:val="single" w:color="F2B400" w:sz="24"/>
+              <w:bottom w:val="single" w:color="F2B400" w:sz="4"/>
+              <w:right w:val="single" w:color="F2B400" w:sz="4"/>
+            </w:tcBorders>
+            <w:shd w:fill="FFFFFF" w:color="auto" w:val="clear"/>
+            <w:tcMar>
+              <w:top w:type="dxa" w:w="60"/>
+              <w:left w:type="dxa" w:w="100"/>
+              <w:bottom w:type="dxa" w:w="60"/>
+              <w:right w:type="dxa" w:w="60"/>
+            </w:tcMar>
+            <w:vAlign w:val="center"/>
+          </w:tcPr>
+          <w:p>
+            <w:pPr>
+              <w:spacing w:after="0"/>
+              <w:jc w:val="center"/>
+            </w:pPr>
+            <w:r>
+              <w:drawing>
+                <wp:inline distT="0" distB="0" distL="0" distR="0">
+                  <wp:extent cx="838200" cy="838200"/>
+                  <wp:effectExtent t="0" r="0" b="0" l="0"/>
+                  <wp:docPr id="1" name="qr" descr="https://bernardotorio.github.io/automatismos/inversion_giro.html" title="QR Inversión de giro de un motor"/>
+                  <wp:cNvGraphicFramePr>
+                    <a:graphicFrameLocks xmlns:a="http://schemas.openxmlformats.org/drawingml/2006/main" noChangeAspect="1"/>
+                  </wp:cNvGraphicFramePr>
+                  <a:graphic xmlns:a="http://schemas.openxmlformats.org/drawingml/2006/main">
+                    <a:graphicData uri="http://schemas.openxmlformats.org/drawingml/2006/picture">
+                      <pic:pic xmlns:pic="http://schemas.openxmlformats.org/drawingml/2006/picture">
+                        <pic:nvPicPr>
+                          <pic:cNvPr id="0" name="" descr=""/>
+                          <pic:cNvPicPr>
+                            <a:picLocks noChangeAspect="1" noChangeArrowheads="1"/>
+                          </pic:cNvPicPr>
+                        </pic:nvPicPr>
+                        <pic:blipFill>
+                          <a:blip r:embed="rId32" cstate="none"/>
+                          <a:srcRect/>
+                          <a:stretch>
+                            <a:fillRect/>
+                          </a:stretch>
+                        </pic:blipFill>
+                        <pic:spPr bwMode="auto">
+                          <a:xfrm>
+                            <a:off x="0" y="0"/>
+                            <a:ext cx="838200" cy="838200"/>
+                          </a:xfrm>
+                          <a:prstGeom prst="rect">
+                            <a:avLst/>
+                          </a:prstGeom>
+                        </pic:spPr>
+                      </pic:pic>
+                    </a:graphicData>
+                  </a:graphic>
+                </wp:inline>
+              </w:drawing>
+            </w:r>
+          </w:p>
+        </w:tc>
+        <w:tc>
+          <w:tcPr>
+            <w:tcW w:type="dxa" w:w="8206"/>
+            <w:tcBorders>
+              <w:top w:val="single" w:color="F2B400" w:sz="4"/>
+              <w:left w:val="single" w:color="F2B400" w:sz="4"/>
+              <w:bottom w:val="single" w:color="F2B400" w:sz="4"/>
+              <w:right w:val="single" w:color="F2B400" w:sz="4"/>
+            </w:tcBorders>
+            <w:shd w:fill="FFF8E1" w:color="auto" w:val="clear"/>
+            <w:tcMar>
+              <w:top w:type="dxa" w:w="80"/>
+              <w:left w:type="dxa" w:w="160"/>
+              <w:bottom w:type="dxa" w:w="80"/>
+              <w:right w:type="dxa" w:w="140"/>
+            </w:tcMar>
+            <w:vAlign w:val="center"/>
+          </w:tcPr>
+          <w:p>
+            <w:pPr>
+              <w:spacing w:after="30"/>
+            </w:pPr>
+            <w:r>
+              <w:rPr>
+                <w:rFonts w:ascii="Calibri" w:cs="Calibri" w:eastAsia="Calibri" w:hAnsi="Calibri"/>
+                <w:b/>
+                <w:bCs/>
+                <w:color w:val="B07F00"/>
+                <w:sz w:val="20"/>
+                <w:szCs w:val="20"/>
+              </w:rPr>
+              <w:t xml:space="preserve">MÍRALO EN MARCHA  </w:t>
+            </w:r>
+            <w:r>
+              <w:rPr>
+                <w:rFonts w:ascii="Calibri" w:cs="Calibri" w:eastAsia="Calibri" w:hAnsi="Calibri"/>
+                <w:b/>
+                <w:bCs/>
+                <w:sz w:val="21"/>
+                <w:szCs w:val="21"/>
+              </w:rPr>
+              <w:t xml:space="preserve">Inversión de giro de un motor</w:t>
+            </w:r>
+          </w:p>
+          <w:p>
+            <w:pPr>
+              <w:spacing w:after="30"/>
+            </w:pPr>
+            <w:r>
+              <w:rPr>
+                <w:rFonts w:ascii="Calibri" w:cs="Calibri" w:eastAsia="Calibri" w:hAnsi="Calibri"/>
+                <w:sz w:val="20"/>
+                <w:szCs w:val="20"/>
+              </w:rPr>
+              <w:t xml:space="preserve">Fuerza y mando juntos. Arranca en un sentido, sigue cada fase hasta el motor y prueba a quitar el enclavamiento.</w:t>
+            </w:r>
+          </w:p>
+          <w:p>
+            <w:pPr>
+              <w:spacing w:after="0"/>
+            </w:pPr>
+            <w:hyperlink w:history="1" r:id="rIdos_ikqeha8nki_xk3wfgi">
+              <w:r>
+                <w:rPr>
+                  <w:rFonts w:ascii="Calibri" w:cs="Calibri" w:eastAsia="Calibri" w:hAnsi="Calibri"/>
+                  <w:color w:val="2E75B6"/>
+                  <w:sz w:val="17"/>
+                  <w:szCs w:val="17"/>
+                  <w:u w:val="single"/>
+                </w:rPr>
+                <w:t xml:space="preserve">https://bernardotorio.github.io/automatismos/inversion_giro.html</w:t>
+              </w:r>
+            </w:hyperlink>
+          </w:p>
+        </w:tc>
+      </w:tr>
+    </w:tbl>
+    <w:p>
+      <w:pPr>
         <w:pStyle w:val="Heading1"/>
         <w:pageBreakBefore/>
       </w:pPr>
@@ -16308,7 +16635,7 @@
         <w:rPr>
           <w:rFonts w:ascii="Calibri" w:cs="Calibri" w:eastAsia="Calibri" w:hAnsi="Calibri"/>
         </w:rPr>
-        <w:t xml:space="preserve">3.10 Resumen</w:t>
+        <w:t xml:space="preserve">3.11 Resumen</w:t>
       </w:r>
     </w:p>
     <w:tbl>
@@ -17862,6 +18189,124 @@
                 <w:szCs w:val="20"/>
               </w:rPr>
               <w:t xml:space="preserve"> al motor</w:t>
+            </w:r>
+          </w:p>
+        </w:tc>
+      </w:tr>
+      <w:tr>
+        <w:trPr>
+          <w:cantSplit/>
+        </w:trPr>
+        <w:tc>
+          <w:tcPr>
+            <w:tcW w:type="dxa" w:w="2179"/>
+            <w:tcBorders>
+              <w:top w:val="single" w:color="333333" w:sz="6"/>
+              <w:left w:val="single" w:color="333333" w:sz="6"/>
+              <w:bottom w:val="single" w:color="333333" w:sz="6"/>
+              <w:right w:val="single" w:color="333333" w:sz="6"/>
+            </w:tcBorders>
+            <w:shd w:fill="D8EFB8" w:color="auto" w:val="clear"/>
+            <w:tcMar>
+              <w:top w:type="dxa" w:w="50"/>
+              <w:left w:type="dxa" w:w="90"/>
+              <w:bottom w:type="dxa" w:w="50"/>
+              <w:right w:type="dxa" w:w="90"/>
+            </w:tcMar>
+            <w:vAlign w:val="center"/>
+          </w:tcPr>
+          <w:p>
+            <w:pPr>
+              <w:spacing w:after="0"/>
+              <w:jc w:val="left"/>
+            </w:pPr>
+            <w:r>
+              <w:rPr>
+                <w:rFonts w:ascii="Calibri" w:cs="Calibri" w:eastAsia="Calibri" w:hAnsi="Calibri"/>
+                <w:b/>
+                <w:bCs/>
+                <w:sz w:val="20"/>
+                <w:szCs w:val="20"/>
+              </w:rPr>
+              <w:t xml:space="preserve">Inversión de giro</w:t>
+            </w:r>
+          </w:p>
+        </w:tc>
+        <w:tc>
+          <w:tcPr>
+            <w:tcW w:type="dxa" w:w="3962"/>
+            <w:tcBorders>
+              <w:top w:val="single" w:color="333333" w:sz="6"/>
+              <w:left w:val="single" w:color="333333" w:sz="6"/>
+              <w:bottom w:val="single" w:color="333333" w:sz="6"/>
+              <w:right w:val="single" w:color="333333" w:sz="6"/>
+            </w:tcBorders>
+            <w:tcMar>
+              <w:top w:type="dxa" w:w="50"/>
+              <w:left w:type="dxa" w:w="90"/>
+              <w:bottom w:type="dxa" w:w="50"/>
+              <w:right w:type="dxa" w:w="90"/>
+            </w:tcMar>
+            <w:vAlign w:val="center"/>
+          </w:tcPr>
+          <w:p>
+            <w:pPr>
+              <w:spacing w:after="0"/>
+              <w:jc w:val="left"/>
+            </w:pPr>
+            <w:r>
+              <w:rPr>
+                <w:rFonts w:ascii="Calibri" w:cs="Calibri" w:eastAsia="Calibri" w:hAnsi="Calibri"/>
+                <w:b w:val="false"/>
+                <w:bCs w:val="false"/>
+                <w:sz w:val="20"/>
+                <w:szCs w:val="20"/>
+              </w:rPr>
+              <w:t xml:space="preserve">-KM2 cambia L1 por L3; mando con enclavamiento</w:t>
+            </w:r>
+          </w:p>
+        </w:tc>
+        <w:tc>
+          <w:tcPr>
+            <w:tcW w:type="dxa" w:w="3765"/>
+            <w:tcBorders>
+              <w:top w:val="single" w:color="333333" w:sz="6"/>
+              <w:left w:val="single" w:color="333333" w:sz="6"/>
+              <w:bottom w:val="single" w:color="333333" w:sz="6"/>
+              <w:right w:val="single" w:color="333333" w:sz="6"/>
+            </w:tcBorders>
+            <w:tcMar>
+              <w:top w:type="dxa" w:w="50"/>
+              <w:left w:type="dxa" w:w="90"/>
+              <w:bottom w:type="dxa" w:w="50"/>
+              <w:right w:type="dxa" w:w="90"/>
+            </w:tcMar>
+            <w:vAlign w:val="center"/>
+          </w:tcPr>
+          <w:p>
+            <w:pPr>
+              <w:spacing w:after="0"/>
+              <w:jc w:val="left"/>
+            </w:pPr>
+            <w:r>
+              <w:rPr>
+                <w:rFonts w:ascii="Calibri" w:cs="Calibri" w:eastAsia="Calibri" w:hAnsi="Calibri"/>
+                <w:b w:val="false"/>
+                <w:bCs w:val="false"/>
+                <w:sz w:val="20"/>
+                <w:szCs w:val="20"/>
+              </w:rPr>
+              <w:t xml:space="preserve">Que el motor gire </w:t>
+            </w:r>
+            <w:r>
+              <w:rPr>
+                <w:rFonts w:ascii="Calibri" w:cs="Calibri" w:eastAsia="Calibri" w:hAnsi="Calibri"/>
+                <w:b/>
+                <w:bCs/>
+                <w:sz w:val="20"/>
+                <w:szCs w:val="20"/>
+              </w:rPr>
+              <w:t xml:space="preserve">en los dos sentidos</w:t>
             </w:r>
           </w:p>
         </w:tc>

</xml_diff>